<commit_message>
Finish Review 3 report with terminal captures for Chapter 7
- Figures 7.1-7.7 rendered from real terminal output captured on Ubuntu 26.04.1 (WSL 2)
- Section 5.2 tables use the same benchmark run shown in Figure 7.7
- Headings and figures kept on the same page as their content
- refer.md: xz -9e timing updated to match the new run

Co-Authored-By: Claude Opus 5.5 <noreply@anthropic.com>
</commit_message>
<xml_diff>
--- a/docs/Review_3_Smart_Archive_Agent.docx
+++ b/docs/Review_3_Smart_Archive_Agent.docx
@@ -179,6 +179,7 @@
     </w:p>
     <w:p>
       <w:pPr>
+        <w:keepNext/>
         <w:spacing w:after="160" w:before="280"/>
       </w:pPr>
       <w:r>
@@ -193,6 +194,7 @@
     </w:p>
     <w:p>
       <w:pPr>
+        <w:keepNext/>
         <w:spacing w:after="120" w:before="200"/>
       </w:pPr>
       <w:r>
@@ -735,7 +737,7 @@
                 <w:i w:val="0"/>
                 <w:sz w:val="19"/>
               </w:rPr>
-              <w:t>58 passed in 1.51 s (python3 -m pytest -q).</w:t>
+              <w:t>58 passed (python3 -m pytest -q, Figure 7.6).</w:t>
             </w:r>
           </w:p>
         </w:tc>
@@ -748,6 +750,7 @@
     </w:p>
     <w:p>
       <w:pPr>
+        <w:keepNext/>
         <w:spacing w:after="80" w:before="120"/>
       </w:pPr>
       <w:r>
@@ -1525,6 +1528,7 @@
     </w:p>
     <w:p>
       <w:pPr>
+        <w:keepNext/>
         <w:spacing w:after="80" w:before="120"/>
       </w:pPr>
       <w:r>
@@ -2094,6 +2098,7 @@
     </w:p>
     <w:p>
       <w:pPr>
+        <w:keepNext/>
         <w:spacing w:after="80" w:before="120"/>
       </w:pPr>
       <w:r>
@@ -3031,6 +3036,7 @@
     </w:p>
     <w:p>
       <w:pPr>
+        <w:keepNext/>
         <w:spacing w:after="120" w:before="200"/>
       </w:pPr>
       <w:r>
@@ -3054,11 +3060,12 @@
           <w:i w:val="0"/>
           <w:sz w:val="22"/>
         </w:rPr>
-        <w:t>All metrics were measured with benchmarks/evaluate.py in a single run on the environment above; the raw numbers are saved in benchmarks/results.json and can be reproduced with python3 benchmarks/evaluate.py.</w:t>
+        <w:t>All metrics were measured with benchmarks/evaluate.py in a single run on the environment above (the run shown in Figure 7.7); the raw numbers are saved in benchmarks/results.json and can be reproduced with python3 benchmarks/evaluate.py.</w:t>
       </w:r>
     </w:p>
     <w:p>
       <w:pPr>
+        <w:keepNext/>
         <w:spacing w:after="80" w:before="120"/>
       </w:pPr>
       <w:r>
@@ -4012,6 +4019,7 @@
     </w:p>
     <w:p>
       <w:pPr>
+        <w:keepNext/>
         <w:spacing w:after="80" w:before="120"/>
       </w:pPr>
       <w:r>
@@ -4044,7 +4052,7 @@
           <w:i w:val="0"/>
           <w:sz w:val="22"/>
         </w:rPr>
-        <w:t>0.066 ms</w:t>
+        <w:t>0.059 ms</w:t>
       </w:r>
       <w:r>
         <w:rPr>
@@ -4053,7 +4061,7 @@
           <w:i w:val="0"/>
           <w:sz w:val="22"/>
         </w:rPr>
-        <w:t xml:space="preserve"> on average (95th percentile 0.134 ms), so time-to-execution is dominated by the Linux utilities themselves. Execution time was measured on generated data: repetitive log text plus 256 KB of random bytes, which cannot be compressed.</w:t>
+        <w:t xml:space="preserve"> on average (95th percentile 0.122 ms), so time-to-execution is dominated by the Linux utilities themselves. Execution time was measured on generated data: repetitive log text plus 256 KB of random bytes, which cannot be compressed.</w:t>
       </w:r>
     </w:p>
     <w:tbl>
@@ -4262,7 +4270,7 @@
                 <w:i w:val="0"/>
                 <w:sz w:val="19"/>
               </w:rPr>
-              <w:t>10 ms</w:t>
+              <w:t>9 ms</w:t>
             </w:r>
           </w:p>
         </w:tc>
@@ -4368,7 +4376,7 @@
                 <w:i w:val="0"/>
                 <w:sz w:val="19"/>
               </w:rPr>
-              <w:t>13 ms</w:t>
+              <w:t>11 ms</w:t>
             </w:r>
           </w:p>
         </w:tc>
@@ -4474,7 +4482,7 @@
                 <w:i w:val="0"/>
                 <w:sz w:val="19"/>
               </w:rPr>
-              <w:t>203 ms</w:t>
+              <w:t>195 ms</w:t>
             </w:r>
           </w:p>
         </w:tc>
@@ -4580,7 +4588,7 @@
                 <w:i w:val="0"/>
                 <w:sz w:val="19"/>
               </w:rPr>
-              <w:t>75 ms</w:t>
+              <w:t>70 ms</w:t>
             </w:r>
           </w:p>
         </w:tc>
@@ -4686,7 +4694,7 @@
                 <w:i w:val="0"/>
                 <w:sz w:val="19"/>
               </w:rPr>
-              <w:t>137 ms</w:t>
+              <w:t>129 ms</w:t>
             </w:r>
           </w:p>
         </w:tc>
@@ -4792,7 +4800,7 @@
                 <w:i w:val="0"/>
                 <w:sz w:val="19"/>
               </w:rPr>
-              <w:t>8 ms</w:t>
+              <w:t>7 ms</w:t>
             </w:r>
           </w:p>
         </w:tc>
@@ -4898,7 +4906,7 @@
                 <w:i w:val="0"/>
                 <w:sz w:val="19"/>
               </w:rPr>
-              <w:t>17 ms</w:t>
+              <w:t>14 ms</w:t>
             </w:r>
           </w:p>
         </w:tc>
@@ -5004,7 +5012,7 @@
                 <w:i w:val="0"/>
                 <w:sz w:val="19"/>
               </w:rPr>
-              <w:t>27 ms</w:t>
+              <w:t>26 ms</w:t>
             </w:r>
           </w:p>
         </w:tc>
@@ -5110,7 +5118,7 @@
                 <w:i w:val="0"/>
                 <w:sz w:val="19"/>
               </w:rPr>
-              <w:t>1666 ms</w:t>
+              <w:t>1623 ms</w:t>
             </w:r>
           </w:p>
         </w:tc>
@@ -5216,7 +5224,7 @@
                 <w:i w:val="0"/>
                 <w:sz w:val="19"/>
               </w:rPr>
-              <w:t>206 ms</w:t>
+              <w:t>188 ms</w:t>
             </w:r>
           </w:p>
         </w:tc>
@@ -5322,7 +5330,7 @@
                 <w:i w:val="0"/>
                 <w:sz w:val="19"/>
               </w:rPr>
-              <w:t>366 ms</w:t>
+              <w:t>344 ms</w:t>
             </w:r>
           </w:p>
         </w:tc>
@@ -5428,7 +5436,7 @@
                 <w:i w:val="0"/>
                 <w:sz w:val="19"/>
               </w:rPr>
-              <w:t>40 ms</w:t>
+              <w:t>31 ms</w:t>
             </w:r>
           </w:p>
         </w:tc>
@@ -5589,7 +5597,7 @@
                 <w:i w:val="0"/>
                 <w:sz w:val="19"/>
               </w:rPr>
-              <w:t>0.29 s</w:t>
+              <w:t>0.25 s</w:t>
             </w:r>
           </w:p>
         </w:tc>
@@ -5643,7 +5651,7 @@
                 <w:i w:val="0"/>
                 <w:sz w:val="19"/>
               </w:rPr>
-              <w:t>0.13 s (0.13–0.82 s across runs, depending on whether gpg-agent was already running)</w:t>
+              <w:t>0.12 s (0.12–0.82 s across runs, depending on whether gpg-agent was already running)</w:t>
             </w:r>
           </w:p>
         </w:tc>
@@ -5674,11 +5682,12 @@
           <w:i w:val="0"/>
           <w:sz w:val="22"/>
         </w:rPr>
-        <w:t xml:space="preserve"> gzip is the fastest and zip is comparable. bzip2 was the slowest by far (about 1.7 s for 10 MB), which is why the planner never chooses it unless the user asks. xz -9e took about 1.8× the time of xz -6 but produced the same size on this data, because the text part was already compressed almost completely and the random part cannot be compressed. Heavier levels pay off only on data with long-range redundancy.</w:t>
+        <w:t xml:space="preserve"> gzip is the fastest and zip is comparable. bzip2 was the slowest by far (about 1.6 s for 10 MB), which is why the planner never chooses it unless the user asks. xz -9e took about 1.8× the time of xz -6 but produced the same size on this data, because the text part was already compressed almost completely and the random part cannot be compressed. Heavier levels pay off only on data with long-range redundancy.</w:t>
       </w:r>
     </w:p>
     <w:p>
       <w:pPr>
+        <w:keepNext/>
         <w:spacing w:after="80" w:before="120"/>
       </w:pPr>
       <w:r>
@@ -6783,6 +6792,7 @@
     </w:p>
     <w:p>
       <w:pPr>
+        <w:keepNext/>
         <w:spacing w:after="160" w:before="280"/>
       </w:pPr>
       <w:r>
@@ -6797,6 +6807,7 @@
     </w:p>
     <w:p>
       <w:pPr>
+        <w:keepNext/>
         <w:spacing w:after="120" w:before="200"/>
       </w:pPr>
       <w:r>
@@ -6969,6 +6980,7 @@
     </w:p>
     <w:p>
       <w:pPr>
+        <w:keepNext/>
         <w:spacing w:after="120" w:before="200"/>
       </w:pPr>
       <w:r>
@@ -7103,6 +7115,7 @@
     </w:p>
     <w:p>
       <w:pPr>
+        <w:keepNext/>
         <w:spacing w:after="120" w:before="200"/>
       </w:pPr>
       <w:r>
@@ -7261,6 +7274,7 @@
     </w:p>
     <w:p>
       <w:pPr>
+        <w:keepNext/>
         <w:spacing w:after="160" w:before="280"/>
       </w:pPr>
       <w:r>
@@ -7284,7 +7298,7 @@
           <w:i w:val="0"/>
           <w:sz w:val="22"/>
         </w:rPr>
-        <w:t>The screenshots below were captured on Ubuntu (WSL 2). A small demo folder is used so the archive is quick to create. Each figure is preceded by the commands typed.</w:t>
+        <w:t>The figures below are the terminal output of the demonstration, captured on Ubuntu 26.04.1 LTS (WSL 2) on 22 October 2026 and shown as terminal images. Each figure begins with the command or request that was typed; passphrases do not appear because they are read with hidden input. A small demo folder is used so the archive is quick to create. It was prepared with:</w:t>
       </w:r>
     </w:p>
     <w:tbl>
@@ -7368,6 +7382,7 @@
     </w:p>
     <w:p>
       <w:pPr>
+        <w:keepNext/>
         <w:spacing w:after="120" w:before="200"/>
       </w:pPr>
       <w:r>
@@ -7380,149 +7395,47 @@
         <w:t>7.1 Environment Check</w:t>
       </w:r>
     </w:p>
-    <w:tbl>
-      <w:tblPr>
-        <w:tblW w:type="auto" w:w="0"/>
-        <w:tblLook w:firstColumn="1" w:firstRow="1" w:lastColumn="0" w:lastRow="0" w:noHBand="0" w:noVBand="1" w:val="04A0"/>
-        <w:jc w:val="center"/>
-        <w:tblLayout w:type="fixed"/>
-      </w:tblPr>
-      <w:tblGrid>
-        <w:gridCol w:w="9360"/>
-      </w:tblGrid>
-      <w:tr>
-        <w:tc>
-          <w:tcPr>
-            <w:tcW w:type="dxa" w:w="9360"/>
-            <w:shd w:val="clear" w:color="auto" w:fill="1E1E1E"/>
-            <w:tcMar>
-              <w:top w:w="80" w:type="dxa"/>
-              <w:bottom w:w="80" w:type="dxa"/>
-              <w:left w:w="150" w:type="dxa"/>
-              <w:right w:w="150" w:type="dxa"/>
-            </w:tcMar>
-          </w:tcPr>
-          <w:p>
-            <w:pPr>
-              <w:spacing w:after="0"/>
-            </w:pPr>
-            <w:r>
-              <w:rPr>
-                <w:rFonts w:ascii="Consolas" w:hAnsi="Consolas"/>
-                <w:b/>
-                <w:i w:val="0"/>
-                <w:color w:val="00FF80"/>
-                <w:sz w:val="18"/>
-              </w:rPr>
-              <w:t xml:space="preserve">$ </w:t>
-            </w:r>
-            <w:r>
-              <w:rPr>
-                <w:rFonts w:ascii="Consolas" w:hAnsi="Consolas"/>
-                <w:b/>
-                <w:i w:val="0"/>
-                <w:color w:val="FFFFFF"/>
-                <w:sz w:val="18"/>
-              </w:rPr>
-              <w:t>python3 -m smart_archive_agent --doctor</w:t>
-            </w:r>
-          </w:p>
-        </w:tc>
-      </w:tr>
-    </w:tbl>
     <w:p>
       <w:pPr>
-        <w:spacing w:after="80"/>
+        <w:keepNext/>
+        <w:spacing w:after="40"/>
+        <w:jc w:val="center"/>
       </w:pPr>
+      <w:r>
+        <w:drawing>
+          <wp:inline xmlns:a="http://schemas.openxmlformats.org/drawingml/2006/main" xmlns:pic="http://schemas.openxmlformats.org/drawingml/2006/picture">
+            <wp:extent cx="5943600" cy="1513290"/>
+            <wp:docPr id="1" name="Picture 1"/>
+            <wp:cNvGraphicFramePr>
+              <a:graphicFrameLocks noChangeAspect="1"/>
+            </wp:cNvGraphicFramePr>
+            <a:graphic>
+              <a:graphicData uri="http://schemas.openxmlformats.org/drawingml/2006/picture">
+                <pic:pic>
+                  <pic:nvPicPr>
+                    <pic:cNvPr id="0" name="image.png"/>
+                    <pic:cNvPicPr/>
+                  </pic:nvPicPr>
+                  <pic:blipFill>
+                    <a:blip r:embed="rId9"/>
+                    <a:stretch>
+                      <a:fillRect/>
+                    </a:stretch>
+                  </pic:blipFill>
+                  <pic:spPr>
+                    <a:xfrm>
+                      <a:off x="0" y="0"/>
+                      <a:ext cx="5943600" cy="1513290"/>
+                    </a:xfrm>
+                    <a:prstGeom prst="rect"/>
+                  </pic:spPr>
+                </pic:pic>
+              </a:graphicData>
+            </a:graphic>
+          </wp:inline>
+        </w:drawing>
+      </w:r>
     </w:p>
-    <w:tbl>
-      <w:tblPr>
-        <w:tblW w:type="auto" w:w="0"/>
-        <w:tblLook w:firstColumn="1" w:firstRow="1" w:lastColumn="0" w:lastRow="0" w:noHBand="0" w:noVBand="1" w:val="04A0"/>
-        <w:jc w:val="center"/>
-        <w:tblLayout w:type="fixed"/>
-        <w:tblBorders>
-          <w:top w:val="single" w:sz="4" w:space="0" w:color="BFBFBF"/>
-          <w:left w:val="single" w:sz="4" w:space="0" w:color="BFBFBF"/>
-          <w:bottom w:val="single" w:sz="4" w:space="0" w:color="BFBFBF"/>
-          <w:right w:val="single" w:sz="4" w:space="0" w:color="BFBFBF"/>
-          <w:insideH w:val="single" w:sz="4" w:space="0" w:color="BFBFBF"/>
-          <w:insideV w:val="single" w:sz="4" w:space="0" w:color="BFBFBF"/>
-        </w:tblBorders>
-      </w:tblPr>
-      <w:tblGrid>
-        <w:gridCol w:w="9360"/>
-      </w:tblGrid>
-      <w:tr>
-        <w:tc>
-          <w:tcPr>
-            <w:tcW w:type="dxa" w:w="9360"/>
-            <w:shd w:val="clear" w:color="auto" w:fill="F7F7F7"/>
-            <w:tcMar>
-              <w:top w:w="80" w:type="dxa"/>
-              <w:bottom w:w="80" w:type="dxa"/>
-              <w:left w:w="100" w:type="dxa"/>
-              <w:right w:w="100" w:type="dxa"/>
-            </w:tcMar>
-          </w:tcPr>
-          <w:p>
-            <w:pPr>
-              <w:jc w:val="center"/>
-            </w:pPr>
-            <w:r>
-              <w:br/>
-              <w:t/>
-            </w:r>
-            <w:r>
-              <w:br/>
-              <w:t/>
-            </w:r>
-            <w:r>
-              <w:br/>
-              <w:t/>
-            </w:r>
-            <w:r>
-              <w:br/>
-              <w:t/>
-            </w:r>
-            <w:r>
-              <w:br/>
-              <w:t/>
-            </w:r>
-            <w:r>
-              <w:rPr>
-                <w:rFonts w:ascii="Calibri" w:hAnsi="Calibri"/>
-                <w:b w:val="0"/>
-                <w:i/>
-                <w:color w:val="808080"/>
-                <w:sz w:val="20"/>
-              </w:rPr>
-              <w:t>[ Paste screenshot here ]</w:t>
-            </w:r>
-            <w:r>
-              <w:br/>
-              <w:t/>
-            </w:r>
-            <w:r>
-              <w:br/>
-              <w:t/>
-            </w:r>
-            <w:r>
-              <w:br/>
-              <w:t/>
-            </w:r>
-            <w:r>
-              <w:br/>
-              <w:t/>
-            </w:r>
-            <w:r>
-              <w:br/>
-              <w:t/>
-            </w:r>
-          </w:p>
-        </w:tc>
-      </w:tr>
-    </w:tbl>
     <w:p>
       <w:pPr>
         <w:spacing w:after="200"/>
@@ -7540,6 +7453,7 @@
     </w:p>
     <w:p>
       <w:pPr>
+        <w:keepNext/>
         <w:spacing w:after="120" w:before="200"/>
       </w:pPr>
       <w:r>
@@ -7552,197 +7466,47 @@
         <w:t>7.2 Brief's Example: Plan, Confirmation and Encryption</w:t>
       </w:r>
     </w:p>
-    <w:tbl>
-      <w:tblPr>
-        <w:tblW w:type="auto" w:w="0"/>
-        <w:tblLook w:firstColumn="1" w:firstRow="1" w:lastColumn="0" w:lastRow="0" w:noHBand="0" w:noVBand="1" w:val="04A0"/>
-        <w:jc w:val="center"/>
-        <w:tblLayout w:type="fixed"/>
-      </w:tblPr>
-      <w:tblGrid>
-        <w:gridCol w:w="9360"/>
-      </w:tblGrid>
-      <w:tr>
-        <w:tc>
-          <w:tcPr>
-            <w:tcW w:type="dxa" w:w="9360"/>
-            <w:shd w:val="clear" w:color="auto" w:fill="1E1E1E"/>
-            <w:tcMar>
-              <w:top w:w="80" w:type="dxa"/>
-              <w:bottom w:w="80" w:type="dxa"/>
-              <w:left w:w="150" w:type="dxa"/>
-              <w:right w:w="150" w:type="dxa"/>
-            </w:tcMar>
-          </w:tcPr>
-          <w:p>
-            <w:pPr>
-              <w:spacing w:after="0"/>
-            </w:pPr>
-            <w:r>
-              <w:rPr>
-                <w:rFonts w:ascii="Consolas" w:hAnsi="Consolas"/>
-                <w:b/>
-                <w:i w:val="0"/>
-                <w:color w:val="00FF80"/>
-                <w:sz w:val="18"/>
-              </w:rPr>
-              <w:t xml:space="preserve">$ </w:t>
-            </w:r>
-            <w:r>
-              <w:rPr>
-                <w:rFonts w:ascii="Consolas" w:hAnsi="Consolas"/>
-                <w:b/>
-                <w:i w:val="0"/>
-                <w:color w:val="FFFFFF"/>
-                <w:sz w:val="18"/>
-              </w:rPr>
-              <w:t>python3 -m smart_archive_agent</w:t>
-            </w:r>
-            <w:r>
-              <w:br/>
-              <w:t/>
-            </w:r>
-            <w:r>
-              <w:rPr>
-                <w:rFonts w:ascii="Consolas" w:hAnsi="Consolas"/>
-                <w:b/>
-                <w:i w:val="0"/>
-                <w:color w:val="00FF80"/>
-                <w:sz w:val="18"/>
-              </w:rPr>
-              <w:t xml:space="preserve">You: </w:t>
-            </w:r>
-            <w:r>
-              <w:rPr>
-                <w:rFonts w:ascii="Consolas" w:hAnsi="Consolas"/>
-                <w:b/>
-                <w:i w:val="0"/>
-                <w:color w:val="FFFFFF"/>
-                <w:sz w:val="18"/>
-              </w:rPr>
-              <w:t>Zip up my project folder, compress it heavily, and encrypt it.</w:t>
-            </w:r>
-            <w:r>
-              <w:br/>
-              <w:t/>
-            </w:r>
-            <w:r>
-              <w:rPr>
-                <w:rFonts w:ascii="Consolas" w:hAnsi="Consolas"/>
-                <w:b/>
-                <w:i w:val="0"/>
-                <w:color w:val="00FF80"/>
-                <w:sz w:val="18"/>
-              </w:rPr>
-              <w:t xml:space="preserve">Proceed? [y/N]: </w:t>
-            </w:r>
-            <w:r>
-              <w:rPr>
-                <w:rFonts w:ascii="Consolas" w:hAnsi="Consolas"/>
-                <w:b/>
-                <w:i w:val="0"/>
-                <w:color w:val="FFFFFF"/>
-                <w:sz w:val="18"/>
-              </w:rPr>
-              <w:t>y</w:t>
-            </w:r>
-          </w:p>
-        </w:tc>
-      </w:tr>
-    </w:tbl>
     <w:p>
       <w:pPr>
-        <w:spacing w:after="80"/>
+        <w:keepNext/>
+        <w:spacing w:after="40"/>
+        <w:jc w:val="center"/>
       </w:pPr>
+      <w:r>
+        <w:drawing>
+          <wp:inline xmlns:a="http://schemas.openxmlformats.org/drawingml/2006/main" xmlns:pic="http://schemas.openxmlformats.org/drawingml/2006/picture">
+            <wp:extent cx="5943600" cy="3142987"/>
+            <wp:docPr id="2" name="Picture 2"/>
+            <wp:cNvGraphicFramePr>
+              <a:graphicFrameLocks noChangeAspect="1"/>
+            </wp:cNvGraphicFramePr>
+            <a:graphic>
+              <a:graphicData uri="http://schemas.openxmlformats.org/drawingml/2006/picture">
+                <pic:pic>
+                  <pic:nvPicPr>
+                    <pic:cNvPr id="0" name="image.png"/>
+                    <pic:cNvPicPr/>
+                  </pic:nvPicPr>
+                  <pic:blipFill>
+                    <a:blip r:embed="rId10"/>
+                    <a:stretch>
+                      <a:fillRect/>
+                    </a:stretch>
+                  </pic:blipFill>
+                  <pic:spPr>
+                    <a:xfrm>
+                      <a:off x="0" y="0"/>
+                      <a:ext cx="5943600" cy="3142987"/>
+                    </a:xfrm>
+                    <a:prstGeom prst="rect"/>
+                  </pic:spPr>
+                </pic:pic>
+              </a:graphicData>
+            </a:graphic>
+          </wp:inline>
+        </w:drawing>
+      </w:r>
     </w:p>
-    <w:tbl>
-      <w:tblPr>
-        <w:tblW w:type="auto" w:w="0"/>
-        <w:tblLook w:firstColumn="1" w:firstRow="1" w:lastColumn="0" w:lastRow="0" w:noHBand="0" w:noVBand="1" w:val="04A0"/>
-        <w:jc w:val="center"/>
-        <w:tblLayout w:type="fixed"/>
-        <w:tblBorders>
-          <w:top w:val="single" w:sz="4" w:space="0" w:color="BFBFBF"/>
-          <w:left w:val="single" w:sz="4" w:space="0" w:color="BFBFBF"/>
-          <w:bottom w:val="single" w:sz="4" w:space="0" w:color="BFBFBF"/>
-          <w:right w:val="single" w:sz="4" w:space="0" w:color="BFBFBF"/>
-          <w:insideH w:val="single" w:sz="4" w:space="0" w:color="BFBFBF"/>
-          <w:insideV w:val="single" w:sz="4" w:space="0" w:color="BFBFBF"/>
-        </w:tblBorders>
-      </w:tblPr>
-      <w:tblGrid>
-        <w:gridCol w:w="9360"/>
-      </w:tblGrid>
-      <w:tr>
-        <w:tc>
-          <w:tcPr>
-            <w:tcW w:type="dxa" w:w="9360"/>
-            <w:shd w:val="clear" w:color="auto" w:fill="F7F7F7"/>
-            <w:tcMar>
-              <w:top w:w="80" w:type="dxa"/>
-              <w:bottom w:w="80" w:type="dxa"/>
-              <w:left w:w="100" w:type="dxa"/>
-              <w:right w:w="100" w:type="dxa"/>
-            </w:tcMar>
-          </w:tcPr>
-          <w:p>
-            <w:pPr>
-              <w:jc w:val="center"/>
-            </w:pPr>
-            <w:r>
-              <w:br/>
-              <w:t/>
-            </w:r>
-            <w:r>
-              <w:br/>
-              <w:t/>
-            </w:r>
-            <w:r>
-              <w:br/>
-              <w:t/>
-            </w:r>
-            <w:r>
-              <w:br/>
-              <w:t/>
-            </w:r>
-            <w:r>
-              <w:br/>
-              <w:t/>
-            </w:r>
-            <w:r>
-              <w:rPr>
-                <w:rFonts w:ascii="Calibri" w:hAnsi="Calibri"/>
-                <w:b w:val="0"/>
-                <w:i/>
-                <w:color w:val="808080"/>
-                <w:sz w:val="20"/>
-              </w:rPr>
-              <w:t>[ Paste screenshot here ]</w:t>
-            </w:r>
-            <w:r>
-              <w:br/>
-              <w:t/>
-            </w:r>
-            <w:r>
-              <w:br/>
-              <w:t/>
-            </w:r>
-            <w:r>
-              <w:br/>
-              <w:t/>
-            </w:r>
-            <w:r>
-              <w:br/>
-              <w:t/>
-            </w:r>
-            <w:r>
-              <w:br/>
-              <w:t/>
-            </w:r>
-          </w:p>
-        </w:tc>
-      </w:tr>
-    </w:tbl>
     <w:p>
       <w:pPr>
         <w:spacing w:after="200"/>
@@ -7760,6 +7524,7 @@
     </w:p>
     <w:p>
       <w:pPr>
+        <w:keepNext/>
         <w:spacing w:after="120" w:before="200"/>
       </w:pPr>
       <w:r>
@@ -7772,173 +7537,47 @@
         <w:t>7.3 Fast Compression and Inspection</w:t>
       </w:r>
     </w:p>
-    <w:tbl>
-      <w:tblPr>
-        <w:tblW w:type="auto" w:w="0"/>
-        <w:tblLook w:firstColumn="1" w:firstRow="1" w:lastColumn="0" w:lastRow="0" w:noHBand="0" w:noVBand="1" w:val="04A0"/>
-        <w:jc w:val="center"/>
-        <w:tblLayout w:type="fixed"/>
-      </w:tblPr>
-      <w:tblGrid>
-        <w:gridCol w:w="9360"/>
-      </w:tblGrid>
-      <w:tr>
-        <w:tc>
-          <w:tcPr>
-            <w:tcW w:type="dxa" w:w="9360"/>
-            <w:shd w:val="clear" w:color="auto" w:fill="1E1E1E"/>
-            <w:tcMar>
-              <w:top w:w="80" w:type="dxa"/>
-              <w:bottom w:w="80" w:type="dxa"/>
-              <w:left w:w="150" w:type="dxa"/>
-              <w:right w:w="150" w:type="dxa"/>
-            </w:tcMar>
-          </w:tcPr>
-          <w:p>
-            <w:pPr>
-              <w:spacing w:after="0"/>
-            </w:pPr>
-            <w:r>
-              <w:rPr>
-                <w:rFonts w:ascii="Consolas" w:hAnsi="Consolas"/>
-                <w:b/>
-                <w:i w:val="0"/>
-                <w:color w:val="00FF80"/>
-                <w:sz w:val="18"/>
-              </w:rPr>
-              <w:t xml:space="preserve">You: </w:t>
-            </w:r>
-            <w:r>
-              <w:rPr>
-                <w:rFonts w:ascii="Consolas" w:hAnsi="Consolas"/>
-                <w:b/>
-                <w:i w:val="0"/>
-                <w:color w:val="FFFFFF"/>
-                <w:sz w:val="18"/>
-              </w:rPr>
-              <w:t>archive ./docs quickly</w:t>
-            </w:r>
-            <w:r>
-              <w:br/>
-              <w:t/>
-            </w:r>
-            <w:r>
-              <w:rPr>
-                <w:rFonts w:ascii="Consolas" w:hAnsi="Consolas"/>
-                <w:b/>
-                <w:i w:val="0"/>
-                <w:color w:val="00FF80"/>
-                <w:sz w:val="18"/>
-              </w:rPr>
-              <w:t xml:space="preserve">You: </w:t>
-            </w:r>
-            <w:r>
-              <w:rPr>
-                <w:rFonts w:ascii="Consolas" w:hAnsi="Consolas"/>
-                <w:b/>
-                <w:i w:val="0"/>
-                <w:color w:val="FFFFFF"/>
-                <w:sz w:val="18"/>
-              </w:rPr>
-              <w:t>inspect archive ./docs.tar.gz</w:t>
-            </w:r>
-          </w:p>
-        </w:tc>
-      </w:tr>
-    </w:tbl>
     <w:p>
       <w:pPr>
-        <w:spacing w:after="80"/>
+        <w:keepNext/>
+        <w:spacing w:after="40"/>
+        <w:jc w:val="center"/>
       </w:pPr>
+      <w:r>
+        <w:drawing>
+          <wp:inline xmlns:a="http://schemas.openxmlformats.org/drawingml/2006/main" xmlns:pic="http://schemas.openxmlformats.org/drawingml/2006/picture">
+            <wp:extent cx="5943600" cy="4190649"/>
+            <wp:docPr id="3" name="Picture 3"/>
+            <wp:cNvGraphicFramePr>
+              <a:graphicFrameLocks noChangeAspect="1"/>
+            </wp:cNvGraphicFramePr>
+            <a:graphic>
+              <a:graphicData uri="http://schemas.openxmlformats.org/drawingml/2006/picture">
+                <pic:pic>
+                  <pic:nvPicPr>
+                    <pic:cNvPr id="0" name="image.png"/>
+                    <pic:cNvPicPr/>
+                  </pic:nvPicPr>
+                  <pic:blipFill>
+                    <a:blip r:embed="rId11"/>
+                    <a:stretch>
+                      <a:fillRect/>
+                    </a:stretch>
+                  </pic:blipFill>
+                  <pic:spPr>
+                    <a:xfrm>
+                      <a:off x="0" y="0"/>
+                      <a:ext cx="5943600" cy="4190649"/>
+                    </a:xfrm>
+                    <a:prstGeom prst="rect"/>
+                  </pic:spPr>
+                </pic:pic>
+              </a:graphicData>
+            </a:graphic>
+          </wp:inline>
+        </w:drawing>
+      </w:r>
     </w:p>
-    <w:tbl>
-      <w:tblPr>
-        <w:tblW w:type="auto" w:w="0"/>
-        <w:tblLook w:firstColumn="1" w:firstRow="1" w:lastColumn="0" w:lastRow="0" w:noHBand="0" w:noVBand="1" w:val="04A0"/>
-        <w:jc w:val="center"/>
-        <w:tblLayout w:type="fixed"/>
-        <w:tblBorders>
-          <w:top w:val="single" w:sz="4" w:space="0" w:color="BFBFBF"/>
-          <w:left w:val="single" w:sz="4" w:space="0" w:color="BFBFBF"/>
-          <w:bottom w:val="single" w:sz="4" w:space="0" w:color="BFBFBF"/>
-          <w:right w:val="single" w:sz="4" w:space="0" w:color="BFBFBF"/>
-          <w:insideH w:val="single" w:sz="4" w:space="0" w:color="BFBFBF"/>
-          <w:insideV w:val="single" w:sz="4" w:space="0" w:color="BFBFBF"/>
-        </w:tblBorders>
-      </w:tblPr>
-      <w:tblGrid>
-        <w:gridCol w:w="9360"/>
-      </w:tblGrid>
-      <w:tr>
-        <w:tc>
-          <w:tcPr>
-            <w:tcW w:type="dxa" w:w="9360"/>
-            <w:shd w:val="clear" w:color="auto" w:fill="F7F7F7"/>
-            <w:tcMar>
-              <w:top w:w="80" w:type="dxa"/>
-              <w:bottom w:w="80" w:type="dxa"/>
-              <w:left w:w="100" w:type="dxa"/>
-              <w:right w:w="100" w:type="dxa"/>
-            </w:tcMar>
-          </w:tcPr>
-          <w:p>
-            <w:pPr>
-              <w:jc w:val="center"/>
-            </w:pPr>
-            <w:r>
-              <w:br/>
-              <w:t/>
-            </w:r>
-            <w:r>
-              <w:br/>
-              <w:t/>
-            </w:r>
-            <w:r>
-              <w:br/>
-              <w:t/>
-            </w:r>
-            <w:r>
-              <w:br/>
-              <w:t/>
-            </w:r>
-            <w:r>
-              <w:br/>
-              <w:t/>
-            </w:r>
-            <w:r>
-              <w:rPr>
-                <w:rFonts w:ascii="Calibri" w:hAnsi="Calibri"/>
-                <w:b w:val="0"/>
-                <w:i/>
-                <w:color w:val="808080"/>
-                <w:sz w:val="20"/>
-              </w:rPr>
-              <w:t>[ Paste screenshot here ]</w:t>
-            </w:r>
-            <w:r>
-              <w:br/>
-              <w:t/>
-            </w:r>
-            <w:r>
-              <w:br/>
-              <w:t/>
-            </w:r>
-            <w:r>
-              <w:br/>
-              <w:t/>
-            </w:r>
-            <w:r>
-              <w:br/>
-              <w:t/>
-            </w:r>
-            <w:r>
-              <w:br/>
-              <w:t/>
-            </w:r>
-          </w:p>
-        </w:tc>
-      </w:tr>
-    </w:tbl>
     <w:p>
       <w:pPr>
         <w:spacing w:after="200"/>
@@ -7956,6 +7595,7 @@
     </w:p>
     <w:p>
       <w:pPr>
+        <w:keepNext/>
         <w:spacing w:after="120" w:before="200"/>
       </w:pPr>
       <w:r>
@@ -7968,149 +7608,47 @@
         <w:t>7.4 Decrypting and Extracting in One Request</w:t>
       </w:r>
     </w:p>
-    <w:tbl>
-      <w:tblPr>
-        <w:tblW w:type="auto" w:w="0"/>
-        <w:tblLook w:firstColumn="1" w:firstRow="1" w:lastColumn="0" w:lastRow="0" w:noHBand="0" w:noVBand="1" w:val="04A0"/>
-        <w:jc w:val="center"/>
-        <w:tblLayout w:type="fixed"/>
-      </w:tblPr>
-      <w:tblGrid>
-        <w:gridCol w:w="9360"/>
-      </w:tblGrid>
-      <w:tr>
-        <w:tc>
-          <w:tcPr>
-            <w:tcW w:type="dxa" w:w="9360"/>
-            <w:shd w:val="clear" w:color="auto" w:fill="1E1E1E"/>
-            <w:tcMar>
-              <w:top w:w="80" w:type="dxa"/>
-              <w:bottom w:w="80" w:type="dxa"/>
-              <w:left w:w="150" w:type="dxa"/>
-              <w:right w:w="150" w:type="dxa"/>
-            </w:tcMar>
-          </w:tcPr>
-          <w:p>
-            <w:pPr>
-              <w:spacing w:after="0"/>
-            </w:pPr>
-            <w:r>
-              <w:rPr>
-                <w:rFonts w:ascii="Consolas" w:hAnsi="Consolas"/>
-                <w:b/>
-                <w:i w:val="0"/>
-                <w:color w:val="00FF80"/>
-                <w:sz w:val="18"/>
-              </w:rPr>
-              <w:t xml:space="preserve">You: </w:t>
-            </w:r>
-            <w:r>
-              <w:rPr>
-                <w:rFonts w:ascii="Consolas" w:hAnsi="Consolas"/>
-                <w:b/>
-                <w:i w:val="0"/>
-                <w:color w:val="FFFFFF"/>
-                <w:sz w:val="18"/>
-              </w:rPr>
-              <w:t>decrypt ../project.tar.xz.gpg and extract it</w:t>
-            </w:r>
-          </w:p>
-        </w:tc>
-      </w:tr>
-    </w:tbl>
     <w:p>
       <w:pPr>
-        <w:spacing w:after="80"/>
+        <w:keepNext/>
+        <w:spacing w:after="40"/>
+        <w:jc w:val="center"/>
       </w:pPr>
+      <w:r>
+        <w:drawing>
+          <wp:inline xmlns:a="http://schemas.openxmlformats.org/drawingml/2006/main" xmlns:pic="http://schemas.openxmlformats.org/drawingml/2006/picture">
+            <wp:extent cx="5943600" cy="2211731"/>
+            <wp:docPr id="4" name="Picture 4"/>
+            <wp:cNvGraphicFramePr>
+              <a:graphicFrameLocks noChangeAspect="1"/>
+            </wp:cNvGraphicFramePr>
+            <a:graphic>
+              <a:graphicData uri="http://schemas.openxmlformats.org/drawingml/2006/picture">
+                <pic:pic>
+                  <pic:nvPicPr>
+                    <pic:cNvPr id="0" name="image.png"/>
+                    <pic:cNvPicPr/>
+                  </pic:nvPicPr>
+                  <pic:blipFill>
+                    <a:blip r:embed="rId12"/>
+                    <a:stretch>
+                      <a:fillRect/>
+                    </a:stretch>
+                  </pic:blipFill>
+                  <pic:spPr>
+                    <a:xfrm>
+                      <a:off x="0" y="0"/>
+                      <a:ext cx="5943600" cy="2211731"/>
+                    </a:xfrm>
+                    <a:prstGeom prst="rect"/>
+                  </pic:spPr>
+                </pic:pic>
+              </a:graphicData>
+            </a:graphic>
+          </wp:inline>
+        </w:drawing>
+      </w:r>
     </w:p>
-    <w:tbl>
-      <w:tblPr>
-        <w:tblW w:type="auto" w:w="0"/>
-        <w:tblLook w:firstColumn="1" w:firstRow="1" w:lastColumn="0" w:lastRow="0" w:noHBand="0" w:noVBand="1" w:val="04A0"/>
-        <w:jc w:val="center"/>
-        <w:tblLayout w:type="fixed"/>
-        <w:tblBorders>
-          <w:top w:val="single" w:sz="4" w:space="0" w:color="BFBFBF"/>
-          <w:left w:val="single" w:sz="4" w:space="0" w:color="BFBFBF"/>
-          <w:bottom w:val="single" w:sz="4" w:space="0" w:color="BFBFBF"/>
-          <w:right w:val="single" w:sz="4" w:space="0" w:color="BFBFBF"/>
-          <w:insideH w:val="single" w:sz="4" w:space="0" w:color="BFBFBF"/>
-          <w:insideV w:val="single" w:sz="4" w:space="0" w:color="BFBFBF"/>
-        </w:tblBorders>
-      </w:tblPr>
-      <w:tblGrid>
-        <w:gridCol w:w="9360"/>
-      </w:tblGrid>
-      <w:tr>
-        <w:tc>
-          <w:tcPr>
-            <w:tcW w:type="dxa" w:w="9360"/>
-            <w:shd w:val="clear" w:color="auto" w:fill="F7F7F7"/>
-            <w:tcMar>
-              <w:top w:w="80" w:type="dxa"/>
-              <w:bottom w:w="80" w:type="dxa"/>
-              <w:left w:w="100" w:type="dxa"/>
-              <w:right w:w="100" w:type="dxa"/>
-            </w:tcMar>
-          </w:tcPr>
-          <w:p>
-            <w:pPr>
-              <w:jc w:val="center"/>
-            </w:pPr>
-            <w:r>
-              <w:br/>
-              <w:t/>
-            </w:r>
-            <w:r>
-              <w:br/>
-              <w:t/>
-            </w:r>
-            <w:r>
-              <w:br/>
-              <w:t/>
-            </w:r>
-            <w:r>
-              <w:br/>
-              <w:t/>
-            </w:r>
-            <w:r>
-              <w:br/>
-              <w:t/>
-            </w:r>
-            <w:r>
-              <w:rPr>
-                <w:rFonts w:ascii="Calibri" w:hAnsi="Calibri"/>
-                <w:b w:val="0"/>
-                <w:i/>
-                <w:color w:val="808080"/>
-                <w:sz w:val="20"/>
-              </w:rPr>
-              <w:t>[ Paste screenshot here ]</w:t>
-            </w:r>
-            <w:r>
-              <w:br/>
-              <w:t/>
-            </w:r>
-            <w:r>
-              <w:br/>
-              <w:t/>
-            </w:r>
-            <w:r>
-              <w:br/>
-              <w:t/>
-            </w:r>
-            <w:r>
-              <w:br/>
-              <w:t/>
-            </w:r>
-            <w:r>
-              <w:br/>
-              <w:t/>
-            </w:r>
-          </w:p>
-        </w:tc>
-      </w:tr>
-    </w:tbl>
     <w:p>
       <w:pPr>
         <w:spacing w:after="200"/>
@@ -8128,6 +7666,7 @@
     </w:p>
     <w:p>
       <w:pPr>
+        <w:keepNext/>
         <w:spacing w:after="120" w:before="200"/>
       </w:pPr>
       <w:r>
@@ -8140,221 +7679,47 @@
         <w:t>7.5 Guardrails</w:t>
       </w:r>
     </w:p>
-    <w:tbl>
-      <w:tblPr>
-        <w:tblW w:type="auto" w:w="0"/>
-        <w:tblLook w:firstColumn="1" w:firstRow="1" w:lastColumn="0" w:lastRow="0" w:noHBand="0" w:noVBand="1" w:val="04A0"/>
-        <w:jc w:val="center"/>
-        <w:tblLayout w:type="fixed"/>
-      </w:tblPr>
-      <w:tblGrid>
-        <w:gridCol w:w="9360"/>
-      </w:tblGrid>
-      <w:tr>
-        <w:tc>
-          <w:tcPr>
-            <w:tcW w:type="dxa" w:w="9360"/>
-            <w:shd w:val="clear" w:color="auto" w:fill="1E1E1E"/>
-            <w:tcMar>
-              <w:top w:w="80" w:type="dxa"/>
-              <w:bottom w:w="80" w:type="dxa"/>
-              <w:left w:w="150" w:type="dxa"/>
-              <w:right w:w="150" w:type="dxa"/>
-            </w:tcMar>
-          </w:tcPr>
-          <w:p>
-            <w:pPr>
-              <w:spacing w:after="0"/>
-            </w:pPr>
-            <w:r>
-              <w:rPr>
-                <w:rFonts w:ascii="Consolas" w:hAnsi="Consolas"/>
-                <w:b/>
-                <w:i w:val="0"/>
-                <w:color w:val="00FF80"/>
-                <w:sz w:val="18"/>
-              </w:rPr>
-              <w:t xml:space="preserve">You: </w:t>
-            </w:r>
-            <w:r>
-              <w:rPr>
-                <w:rFonts w:ascii="Consolas" w:hAnsi="Consolas"/>
-                <w:b/>
-                <w:i w:val="0"/>
-                <w:color w:val="FFFFFF"/>
-                <w:sz w:val="18"/>
-              </w:rPr>
-              <w:t>rm -rf /</w:t>
-            </w:r>
-            <w:r>
-              <w:br/>
-              <w:t/>
-            </w:r>
-            <w:r>
-              <w:rPr>
-                <w:rFonts w:ascii="Consolas" w:hAnsi="Consolas"/>
-                <w:b/>
-                <w:i w:val="0"/>
-                <w:color w:val="00FF80"/>
-                <w:sz w:val="18"/>
-              </w:rPr>
-              <w:t xml:space="preserve">You: </w:t>
-            </w:r>
-            <w:r>
-              <w:rPr>
-                <w:rFonts w:ascii="Consolas" w:hAnsi="Consolas"/>
-                <w:b/>
-                <w:i w:val="0"/>
-                <w:color w:val="FFFFFF"/>
-                <w:sz w:val="18"/>
-              </w:rPr>
-              <w:t>archive ./docs; rm -rf ~</w:t>
-            </w:r>
-            <w:r>
-              <w:br/>
-              <w:t/>
-            </w:r>
-            <w:r>
-              <w:rPr>
-                <w:rFonts w:ascii="Consolas" w:hAnsi="Consolas"/>
-                <w:b/>
-                <w:i w:val="0"/>
-                <w:color w:val="00FF80"/>
-                <w:sz w:val="18"/>
-              </w:rPr>
-              <w:t xml:space="preserve">You: </w:t>
-            </w:r>
-            <w:r>
-              <w:rPr>
-                <w:rFonts w:ascii="Consolas" w:hAnsi="Consolas"/>
-                <w:b/>
-                <w:i w:val="0"/>
-                <w:color w:val="FFFFFF"/>
-                <w:sz w:val="18"/>
-              </w:rPr>
-              <w:t>What is the weather today?</w:t>
-            </w:r>
-            <w:r>
-              <w:br/>
-              <w:t/>
-            </w:r>
-            <w:r>
-              <w:rPr>
-                <w:rFonts w:ascii="Consolas" w:hAnsi="Consolas"/>
-                <w:b/>
-                <w:i w:val="0"/>
-                <w:color w:val="00FF80"/>
-                <w:sz w:val="18"/>
-              </w:rPr>
-              <w:t xml:space="preserve">You: </w:t>
-            </w:r>
-            <w:r>
-              <w:rPr>
-                <w:rFonts w:ascii="Consolas" w:hAnsi="Consolas"/>
-                <w:b/>
-                <w:i w:val="0"/>
-                <w:color w:val="FFFFFF"/>
-                <w:sz w:val="18"/>
-              </w:rPr>
-              <w:t>exit</w:t>
-            </w:r>
-          </w:p>
-        </w:tc>
-      </w:tr>
-    </w:tbl>
     <w:p>
       <w:pPr>
-        <w:spacing w:after="80"/>
+        <w:keepNext/>
+        <w:spacing w:after="40"/>
+        <w:jc w:val="center"/>
       </w:pPr>
+      <w:r>
+        <w:drawing>
+          <wp:inline xmlns:a="http://schemas.openxmlformats.org/drawingml/2006/main" xmlns:pic="http://schemas.openxmlformats.org/drawingml/2006/picture">
+            <wp:extent cx="5943600" cy="2328138"/>
+            <wp:docPr id="5" name="Picture 5"/>
+            <wp:cNvGraphicFramePr>
+              <a:graphicFrameLocks noChangeAspect="1"/>
+            </wp:cNvGraphicFramePr>
+            <a:graphic>
+              <a:graphicData uri="http://schemas.openxmlformats.org/drawingml/2006/picture">
+                <pic:pic>
+                  <pic:nvPicPr>
+                    <pic:cNvPr id="0" name="image.png"/>
+                    <pic:cNvPicPr/>
+                  </pic:nvPicPr>
+                  <pic:blipFill>
+                    <a:blip r:embed="rId13"/>
+                    <a:stretch>
+                      <a:fillRect/>
+                    </a:stretch>
+                  </pic:blipFill>
+                  <pic:spPr>
+                    <a:xfrm>
+                      <a:off x="0" y="0"/>
+                      <a:ext cx="5943600" cy="2328138"/>
+                    </a:xfrm>
+                    <a:prstGeom prst="rect"/>
+                  </pic:spPr>
+                </pic:pic>
+              </a:graphicData>
+            </a:graphic>
+          </wp:inline>
+        </w:drawing>
+      </w:r>
     </w:p>
-    <w:tbl>
-      <w:tblPr>
-        <w:tblW w:type="auto" w:w="0"/>
-        <w:tblLook w:firstColumn="1" w:firstRow="1" w:lastColumn="0" w:lastRow="0" w:noHBand="0" w:noVBand="1" w:val="04A0"/>
-        <w:jc w:val="center"/>
-        <w:tblLayout w:type="fixed"/>
-        <w:tblBorders>
-          <w:top w:val="single" w:sz="4" w:space="0" w:color="BFBFBF"/>
-          <w:left w:val="single" w:sz="4" w:space="0" w:color="BFBFBF"/>
-          <w:bottom w:val="single" w:sz="4" w:space="0" w:color="BFBFBF"/>
-          <w:right w:val="single" w:sz="4" w:space="0" w:color="BFBFBF"/>
-          <w:insideH w:val="single" w:sz="4" w:space="0" w:color="BFBFBF"/>
-          <w:insideV w:val="single" w:sz="4" w:space="0" w:color="BFBFBF"/>
-        </w:tblBorders>
-      </w:tblPr>
-      <w:tblGrid>
-        <w:gridCol w:w="9360"/>
-      </w:tblGrid>
-      <w:tr>
-        <w:tc>
-          <w:tcPr>
-            <w:tcW w:type="dxa" w:w="9360"/>
-            <w:shd w:val="clear" w:color="auto" w:fill="F7F7F7"/>
-            <w:tcMar>
-              <w:top w:w="80" w:type="dxa"/>
-              <w:bottom w:w="80" w:type="dxa"/>
-              <w:left w:w="100" w:type="dxa"/>
-              <w:right w:w="100" w:type="dxa"/>
-            </w:tcMar>
-          </w:tcPr>
-          <w:p>
-            <w:pPr>
-              <w:jc w:val="center"/>
-            </w:pPr>
-            <w:r>
-              <w:br/>
-              <w:t/>
-            </w:r>
-            <w:r>
-              <w:br/>
-              <w:t/>
-            </w:r>
-            <w:r>
-              <w:br/>
-              <w:t/>
-            </w:r>
-            <w:r>
-              <w:br/>
-              <w:t/>
-            </w:r>
-            <w:r>
-              <w:br/>
-              <w:t/>
-            </w:r>
-            <w:r>
-              <w:rPr>
-                <w:rFonts w:ascii="Calibri" w:hAnsi="Calibri"/>
-                <w:b w:val="0"/>
-                <w:i/>
-                <w:color w:val="808080"/>
-                <w:sz w:val="20"/>
-              </w:rPr>
-              <w:t>[ Paste screenshot here ]</w:t>
-            </w:r>
-            <w:r>
-              <w:br/>
-              <w:t/>
-            </w:r>
-            <w:r>
-              <w:br/>
-              <w:t/>
-            </w:r>
-            <w:r>
-              <w:br/>
-              <w:t/>
-            </w:r>
-            <w:r>
-              <w:br/>
-              <w:t/>
-            </w:r>
-            <w:r>
-              <w:br/>
-              <w:t/>
-            </w:r>
-          </w:p>
-        </w:tc>
-      </w:tr>
-    </w:tbl>
     <w:p>
       <w:pPr>
         <w:spacing w:after="200"/>
@@ -8372,6 +7737,7 @@
     </w:p>
     <w:p>
       <w:pPr>
+        <w:keepNext/>
         <w:spacing w:after="120" w:before="200"/>
       </w:pPr>
       <w:r>
@@ -8384,149 +7750,47 @@
         <w:t>7.6 Automated Test Suite</w:t>
       </w:r>
     </w:p>
-    <w:tbl>
-      <w:tblPr>
-        <w:tblW w:type="auto" w:w="0"/>
-        <w:tblLook w:firstColumn="1" w:firstRow="1" w:lastColumn="0" w:lastRow="0" w:noHBand="0" w:noVBand="1" w:val="04A0"/>
-        <w:jc w:val="center"/>
-        <w:tblLayout w:type="fixed"/>
-      </w:tblPr>
-      <w:tblGrid>
-        <w:gridCol w:w="9360"/>
-      </w:tblGrid>
-      <w:tr>
-        <w:tc>
-          <w:tcPr>
-            <w:tcW w:type="dxa" w:w="9360"/>
-            <w:shd w:val="clear" w:color="auto" w:fill="1E1E1E"/>
-            <w:tcMar>
-              <w:top w:w="80" w:type="dxa"/>
-              <w:bottom w:w="80" w:type="dxa"/>
-              <w:left w:w="150" w:type="dxa"/>
-              <w:right w:w="150" w:type="dxa"/>
-            </w:tcMar>
-          </w:tcPr>
-          <w:p>
-            <w:pPr>
-              <w:spacing w:after="0"/>
-            </w:pPr>
-            <w:r>
-              <w:rPr>
-                <w:rFonts w:ascii="Consolas" w:hAnsi="Consolas"/>
-                <w:b/>
-                <w:i w:val="0"/>
-                <w:color w:val="00FF80"/>
-                <w:sz w:val="18"/>
-              </w:rPr>
-              <w:t xml:space="preserve">$ </w:t>
-            </w:r>
-            <w:r>
-              <w:rPr>
-                <w:rFonts w:ascii="Consolas" w:hAnsi="Consolas"/>
-                <w:b/>
-                <w:i w:val="0"/>
-                <w:color w:val="FFFFFF"/>
-                <w:sz w:val="18"/>
-              </w:rPr>
-              <w:t>cd ~/SMART-ARCHIVE-AGENT &amp;&amp; python3 -m pytest -q</w:t>
-            </w:r>
-          </w:p>
-        </w:tc>
-      </w:tr>
-    </w:tbl>
     <w:p>
       <w:pPr>
-        <w:spacing w:after="80"/>
+        <w:keepNext/>
+        <w:spacing w:after="40"/>
+        <w:jc w:val="center"/>
       </w:pPr>
+      <w:r>
+        <w:drawing>
+          <wp:inline xmlns:a="http://schemas.openxmlformats.org/drawingml/2006/main" xmlns:pic="http://schemas.openxmlformats.org/drawingml/2006/picture">
+            <wp:extent cx="5943600" cy="698441"/>
+            <wp:docPr id="6" name="Picture 6"/>
+            <wp:cNvGraphicFramePr>
+              <a:graphicFrameLocks noChangeAspect="1"/>
+            </wp:cNvGraphicFramePr>
+            <a:graphic>
+              <a:graphicData uri="http://schemas.openxmlformats.org/drawingml/2006/picture">
+                <pic:pic>
+                  <pic:nvPicPr>
+                    <pic:cNvPr id="0" name="image.png"/>
+                    <pic:cNvPicPr/>
+                  </pic:nvPicPr>
+                  <pic:blipFill>
+                    <a:blip r:embed="rId14"/>
+                    <a:stretch>
+                      <a:fillRect/>
+                    </a:stretch>
+                  </pic:blipFill>
+                  <pic:spPr>
+                    <a:xfrm>
+                      <a:off x="0" y="0"/>
+                      <a:ext cx="5943600" cy="698441"/>
+                    </a:xfrm>
+                    <a:prstGeom prst="rect"/>
+                  </pic:spPr>
+                </pic:pic>
+              </a:graphicData>
+            </a:graphic>
+          </wp:inline>
+        </w:drawing>
+      </w:r>
     </w:p>
-    <w:tbl>
-      <w:tblPr>
-        <w:tblW w:type="auto" w:w="0"/>
-        <w:tblLook w:firstColumn="1" w:firstRow="1" w:lastColumn="0" w:lastRow="0" w:noHBand="0" w:noVBand="1" w:val="04A0"/>
-        <w:jc w:val="center"/>
-        <w:tblLayout w:type="fixed"/>
-        <w:tblBorders>
-          <w:top w:val="single" w:sz="4" w:space="0" w:color="BFBFBF"/>
-          <w:left w:val="single" w:sz="4" w:space="0" w:color="BFBFBF"/>
-          <w:bottom w:val="single" w:sz="4" w:space="0" w:color="BFBFBF"/>
-          <w:right w:val="single" w:sz="4" w:space="0" w:color="BFBFBF"/>
-          <w:insideH w:val="single" w:sz="4" w:space="0" w:color="BFBFBF"/>
-          <w:insideV w:val="single" w:sz="4" w:space="0" w:color="BFBFBF"/>
-        </w:tblBorders>
-      </w:tblPr>
-      <w:tblGrid>
-        <w:gridCol w:w="9360"/>
-      </w:tblGrid>
-      <w:tr>
-        <w:tc>
-          <w:tcPr>
-            <w:tcW w:type="dxa" w:w="9360"/>
-            <w:shd w:val="clear" w:color="auto" w:fill="F7F7F7"/>
-            <w:tcMar>
-              <w:top w:w="80" w:type="dxa"/>
-              <w:bottom w:w="80" w:type="dxa"/>
-              <w:left w:w="100" w:type="dxa"/>
-              <w:right w:w="100" w:type="dxa"/>
-            </w:tcMar>
-          </w:tcPr>
-          <w:p>
-            <w:pPr>
-              <w:jc w:val="center"/>
-            </w:pPr>
-            <w:r>
-              <w:br/>
-              <w:t/>
-            </w:r>
-            <w:r>
-              <w:br/>
-              <w:t/>
-            </w:r>
-            <w:r>
-              <w:br/>
-              <w:t/>
-            </w:r>
-            <w:r>
-              <w:br/>
-              <w:t/>
-            </w:r>
-            <w:r>
-              <w:br/>
-              <w:t/>
-            </w:r>
-            <w:r>
-              <w:rPr>
-                <w:rFonts w:ascii="Calibri" w:hAnsi="Calibri"/>
-                <w:b w:val="0"/>
-                <w:i/>
-                <w:color w:val="808080"/>
-                <w:sz w:val="20"/>
-              </w:rPr>
-              <w:t>[ Paste screenshot here ]</w:t>
-            </w:r>
-            <w:r>
-              <w:br/>
-              <w:t/>
-            </w:r>
-            <w:r>
-              <w:br/>
-              <w:t/>
-            </w:r>
-            <w:r>
-              <w:br/>
-              <w:t/>
-            </w:r>
-            <w:r>
-              <w:br/>
-              <w:t/>
-            </w:r>
-            <w:r>
-              <w:br/>
-              <w:t/>
-            </w:r>
-          </w:p>
-        </w:tc>
-      </w:tr>
-    </w:tbl>
     <w:p>
       <w:pPr>
         <w:spacing w:after="200"/>
@@ -8544,6 +7808,7 @@
     </w:p>
     <w:p>
       <w:pPr>
+        <w:keepNext/>
         <w:spacing w:after="120" w:before="200"/>
       </w:pPr>
       <w:r>
@@ -8556,149 +7821,47 @@
         <w:t>7.7 Benchmark Results</w:t>
       </w:r>
     </w:p>
-    <w:tbl>
-      <w:tblPr>
-        <w:tblW w:type="auto" w:w="0"/>
-        <w:tblLook w:firstColumn="1" w:firstRow="1" w:lastColumn="0" w:lastRow="0" w:noHBand="0" w:noVBand="1" w:val="04A0"/>
-        <w:jc w:val="center"/>
-        <w:tblLayout w:type="fixed"/>
-      </w:tblPr>
-      <w:tblGrid>
-        <w:gridCol w:w="9360"/>
-      </w:tblGrid>
-      <w:tr>
-        <w:tc>
-          <w:tcPr>
-            <w:tcW w:type="dxa" w:w="9360"/>
-            <w:shd w:val="clear" w:color="auto" w:fill="1E1E1E"/>
-            <w:tcMar>
-              <w:top w:w="80" w:type="dxa"/>
-              <w:bottom w:w="80" w:type="dxa"/>
-              <w:left w:w="150" w:type="dxa"/>
-              <w:right w:w="150" w:type="dxa"/>
-            </w:tcMar>
-          </w:tcPr>
-          <w:p>
-            <w:pPr>
-              <w:spacing w:after="0"/>
-            </w:pPr>
-            <w:r>
-              <w:rPr>
-                <w:rFonts w:ascii="Consolas" w:hAnsi="Consolas"/>
-                <w:b/>
-                <w:i w:val="0"/>
-                <w:color w:val="00FF80"/>
-                <w:sz w:val="18"/>
-              </w:rPr>
-              <w:t xml:space="preserve">$ </w:t>
-            </w:r>
-            <w:r>
-              <w:rPr>
-                <w:rFonts w:ascii="Consolas" w:hAnsi="Consolas"/>
-                <w:b/>
-                <w:i w:val="0"/>
-                <w:color w:val="FFFFFF"/>
-                <w:sz w:val="18"/>
-              </w:rPr>
-              <w:t>python3 benchmarks/evaluate.py</w:t>
-            </w:r>
-          </w:p>
-        </w:tc>
-      </w:tr>
-    </w:tbl>
     <w:p>
       <w:pPr>
-        <w:spacing w:after="80"/>
+        <w:keepNext/>
+        <w:spacing w:after="40"/>
+        <w:jc w:val="center"/>
       </w:pPr>
+      <w:r>
+        <w:drawing>
+          <wp:inline xmlns:a="http://schemas.openxmlformats.org/drawingml/2006/main" xmlns:pic="http://schemas.openxmlformats.org/drawingml/2006/picture">
+            <wp:extent cx="5943600" cy="4772683"/>
+            <wp:docPr id="7" name="Picture 7"/>
+            <wp:cNvGraphicFramePr>
+              <a:graphicFrameLocks noChangeAspect="1"/>
+            </wp:cNvGraphicFramePr>
+            <a:graphic>
+              <a:graphicData uri="http://schemas.openxmlformats.org/drawingml/2006/picture">
+                <pic:pic>
+                  <pic:nvPicPr>
+                    <pic:cNvPr id="0" name="image.png"/>
+                    <pic:cNvPicPr/>
+                  </pic:nvPicPr>
+                  <pic:blipFill>
+                    <a:blip r:embed="rId15"/>
+                    <a:stretch>
+                      <a:fillRect/>
+                    </a:stretch>
+                  </pic:blipFill>
+                  <pic:spPr>
+                    <a:xfrm>
+                      <a:off x="0" y="0"/>
+                      <a:ext cx="5943600" cy="4772683"/>
+                    </a:xfrm>
+                    <a:prstGeom prst="rect"/>
+                  </pic:spPr>
+                </pic:pic>
+              </a:graphicData>
+            </a:graphic>
+          </wp:inline>
+        </w:drawing>
+      </w:r>
     </w:p>
-    <w:tbl>
-      <w:tblPr>
-        <w:tblW w:type="auto" w:w="0"/>
-        <w:tblLook w:firstColumn="1" w:firstRow="1" w:lastColumn="0" w:lastRow="0" w:noHBand="0" w:noVBand="1" w:val="04A0"/>
-        <w:jc w:val="center"/>
-        <w:tblLayout w:type="fixed"/>
-        <w:tblBorders>
-          <w:top w:val="single" w:sz="4" w:space="0" w:color="BFBFBF"/>
-          <w:left w:val="single" w:sz="4" w:space="0" w:color="BFBFBF"/>
-          <w:bottom w:val="single" w:sz="4" w:space="0" w:color="BFBFBF"/>
-          <w:right w:val="single" w:sz="4" w:space="0" w:color="BFBFBF"/>
-          <w:insideH w:val="single" w:sz="4" w:space="0" w:color="BFBFBF"/>
-          <w:insideV w:val="single" w:sz="4" w:space="0" w:color="BFBFBF"/>
-        </w:tblBorders>
-      </w:tblPr>
-      <w:tblGrid>
-        <w:gridCol w:w="9360"/>
-      </w:tblGrid>
-      <w:tr>
-        <w:tc>
-          <w:tcPr>
-            <w:tcW w:type="dxa" w:w="9360"/>
-            <w:shd w:val="clear" w:color="auto" w:fill="F7F7F7"/>
-            <w:tcMar>
-              <w:top w:w="80" w:type="dxa"/>
-              <w:bottom w:w="80" w:type="dxa"/>
-              <w:left w:w="100" w:type="dxa"/>
-              <w:right w:w="100" w:type="dxa"/>
-            </w:tcMar>
-          </w:tcPr>
-          <w:p>
-            <w:pPr>
-              <w:jc w:val="center"/>
-            </w:pPr>
-            <w:r>
-              <w:br/>
-              <w:t/>
-            </w:r>
-            <w:r>
-              <w:br/>
-              <w:t/>
-            </w:r>
-            <w:r>
-              <w:br/>
-              <w:t/>
-            </w:r>
-            <w:r>
-              <w:br/>
-              <w:t/>
-            </w:r>
-            <w:r>
-              <w:br/>
-              <w:t/>
-            </w:r>
-            <w:r>
-              <w:rPr>
-                <w:rFonts w:ascii="Calibri" w:hAnsi="Calibri"/>
-                <w:b w:val="0"/>
-                <w:i/>
-                <w:color w:val="808080"/>
-                <w:sz w:val="20"/>
-              </w:rPr>
-              <w:t>[ Paste screenshot here ]</w:t>
-            </w:r>
-            <w:r>
-              <w:br/>
-              <w:t/>
-            </w:r>
-            <w:r>
-              <w:br/>
-              <w:t/>
-            </w:r>
-            <w:r>
-              <w:br/>
-              <w:t/>
-            </w:r>
-            <w:r>
-              <w:br/>
-              <w:t/>
-            </w:r>
-            <w:r>
-              <w:br/>
-              <w:t/>
-            </w:r>
-          </w:p>
-        </w:tc>
-      </w:tr>
-    </w:tbl>
     <w:p>
       <w:pPr>
         <w:spacing w:after="200"/>
@@ -8716,6 +7879,7 @@
     </w:p>
     <w:p>
       <w:pPr>
+        <w:keepNext/>
         <w:spacing w:after="160" w:before="280"/>
       </w:pPr>
       <w:r>

</xml_diff>